<commit_message>
Remove the privacy and terms pages; the résumé says "since 2018"
The site has no forms, accounts, cookies or analytics, so it does not need
a privacy policy or terms. Removed both pages and everything only they
used: the legal route, policies.ts, the Prose renderer and its Block type,
the footer's legal links, the sitemap's policy routes, their two share
cards, the contact link's email-subject option, Sheet's unused className
and titleAs props, and the CSS behind all of it.

The Word résumé's summary said "7+ years", a count that goes stale every
November in a file that cannot update itself. It now says "since 2018"
(edited through Word; the PDF re-exported).

Co-Authored-By: Claude Opus 5.5 <noreply@anthropic.com>
Claude-Session: https://claude.ai/code/session_015c6jLw3i2eopuQoeTJF87c
</commit_message>
<xml_diff>
--- a/public/founder/rutvik-patel-resume.docx
+++ b/public/founder/rutvik-patel-resume.docx
@@ -98,7 +98,15 @@
           <w:color w:val="111111"/>
           <w:lang w:val="en-US"/>
         </w:rPr>
-        <w:t>Senior frontend engineer with 7+ years building production interfaces for global enterprises and zero-to-one product teams. Architected a multi-tenant agentic AI platform at Ernst &amp; Young, shipped a React Native product through to acquisition, and delivered connected-vehicle frontend architecture for Ford. Deep in React, Next.js and TypeScript, fluent across Node, Python and cloud infrastructure, with a record of measurable gains in performance, engagement and delivery speed.</w:t>
+        <w:t>Senior frontend engineer building production interfaces for global enterprises and zero-to-one product teams since 2018.</w:t>
+      </w:r>
+      <w:r>
+        <w:rPr>
+          <w:rFonts w:ascii="Calibri" w:eastAsia="Calibri" w:hAnsi="Calibri" w:cs="Calibri"/>
+          <w:color w:val="111111"/>
+          <w:lang w:val="en-US"/>
+        </w:rPr>
+        <w:t xml:space="preserve"> Architected a multi-tenant agentic AI platform at Ernst &amp; Young, shipped a React Native product through to acquisition, and delivered connected-vehicle frontend architecture for Ford. Deep in React, Next.js and TypeScript, fluent across Node, Python and cloud infrastructure, with a record of measurable gains in performance, engagement and delivery speed.</w:t>
       </w:r>
     </w:p>
     <w:p>

</xml_diff>